<commit_message>
09/21/26-09/28/26 update team journal
</commit_message>
<xml_diff>
--- a/docs/Team Journal.docx
+++ b/docs/Team Journal.docx
@@ -151,6 +151,130 @@
           <w:rtl w:val="0"/>
         </w:rPr>
         <w:t xml:space="preserve"> </w:t>
+      </w:r>
+    </w:p>
+    <w:p>
+      <w:pPr>
+        <w:rPr/>
+      </w:pPr>
+      <w:r>
+        <w:rPr>
+          <w:rtl w:val="0"/>
+        </w:rPr>
+        <w:t xml:space="preserve">Week 2: 09/21/26-09/28/26</w:t>
+      </w:r>
+    </w:p>
+    <w:p>
+      <w:pPr>
+        <w:rPr/>
+      </w:pPr>
+      <w:r>
+        <w:rPr>
+          <w:rtl w:val="0"/>
+        </w:rPr>
+        <w:t xml:space="preserve">09/22/26 meeting</w:t>
+      </w:r>
+    </w:p>
+    <w:p>
+      <w:pPr>
+        <w:rPr/>
+      </w:pPr>
+      <w:r>
+        <w:rPr>
+          <w:rtl w:val="0"/>
+        </w:rPr>
+        <w:t xml:space="preserve">Discussed: project overview, Jira schedule, mockups, requirements question </w:t>
+      </w:r>
+    </w:p>
+    <w:p>
+      <w:pPr>
+        <w:rPr/>
+      </w:pPr>
+      <w:r>
+        <w:rPr>
+          <w:rtl w:val="0"/>
+        </w:rPr>
+        <w:t xml:space="preserve">Decisions: Liza will create requirement questions, Ksenia will do rest of mockups and walkthrough, Uliana will end Jira schedule, meeting on Thursday </w:t>
+      </w:r>
+    </w:p>
+    <w:p>
+      <w:pPr>
+        <w:rPr/>
+      </w:pPr>
+      <w:r>
+        <w:rPr>
+          <w:rtl w:val="0"/>
+        </w:rPr>
+        <w:t xml:space="preserve">Previous tasks completion: project Overview (without requirements), Jira and GitHub setup, first 6 mockups, half Jira schedule.</w:t>
+      </w:r>
+    </w:p>
+    <w:p>
+      <w:pPr>
+        <w:rPr/>
+      </w:pPr>
+      <w:r>
+        <w:rPr>
+          <w:rtl w:val="0"/>
+        </w:rPr>
+        <w:t xml:space="preserve">Planned tasks for the week: Jira schedule(Uliana), requirements and questions(Liza), Mockups and walkthrough(Ksenia)</w:t>
+      </w:r>
+    </w:p>
+    <w:p>
+      <w:pPr>
+        <w:rPr/>
+      </w:pPr>
+      <w:r>
+        <w:rPr>
+          <w:rtl w:val="0"/>
+        </w:rPr>
+        <w:t xml:space="preserve">Issues: none, on schedule</w:t>
+      </w:r>
+    </w:p>
+    <w:p>
+      <w:pPr>
+        <w:rPr/>
+      </w:pPr>
+      <w:r>
+        <w:rPr>
+          <w:rtl w:val="0"/>
+        </w:rPr>
+        <w:t xml:space="preserve">Meeting recording: </w:t>
+      </w:r>
+      <w:hyperlink r:id="rId7">
+        <w:r>
+          <w:rPr>
+            <w:color w:val="1155cc"/>
+            <w:u w:val="single"/>
+            <w:rtl w:val="0"/>
+          </w:rPr>
+          <w:t xml:space="preserve">https://www.loom.com/share/e1c70bb40fba47acaf4e108c5afb672f</w:t>
+        </w:r>
+      </w:hyperlink>
+      <w:r>
+        <w:rPr>
+          <w:rtl w:val="0"/>
+        </w:rPr>
+        <w:t xml:space="preserve"> </w:t>
+      </w:r>
+    </w:p>
+    <w:p>
+      <w:pPr>
+        <w:rPr/>
+      </w:pPr>
+      <w:r>
+        <w:rPr>
+          <w:rtl w:val="0"/>
+        </w:rPr>
+      </w:r>
+    </w:p>
+    <w:p>
+      <w:pPr>
+        <w:rPr/>
+      </w:pPr>
+      <w:r>
+        <w:rPr>
+          <w:rtl w:val="0"/>
+        </w:rPr>
       </w:r>
     </w:p>
     <w:p>

</xml_diff>

<commit_message>
09/29/26-10/04/26 update team journal
</commit_message>
<xml_diff>
--- a/docs/Team Journal.docx
+++ b/docs/Team Journal.docx
@@ -255,6 +255,130 @@
           <w:rtl w:val="0"/>
         </w:rPr>
         <w:t xml:space="preserve"> </w:t>
+      </w:r>
+    </w:p>
+    <w:p>
+      <w:pPr>
+        <w:rPr/>
+      </w:pPr>
+      <w:r>
+        <w:rPr>
+          <w:rtl w:val="0"/>
+        </w:rPr>
+        <w:t xml:space="preserve">Week 3: 09/29/26-10/04/26</w:t>
+      </w:r>
+    </w:p>
+    <w:p>
+      <w:pPr>
+        <w:rPr/>
+      </w:pPr>
+      <w:r>
+        <w:rPr>
+          <w:rtl w:val="0"/>
+        </w:rPr>
+        <w:t xml:space="preserve">10/01/26 meeting</w:t>
+      </w:r>
+    </w:p>
+    <w:p>
+      <w:pPr>
+        <w:rPr/>
+      </w:pPr>
+      <w:r>
+        <w:rPr>
+          <w:rtl w:val="0"/>
+        </w:rPr>
+        <w:t xml:space="preserve">Discussed: Phase 2 tasks</w:t>
+      </w:r>
+    </w:p>
+    <w:p>
+      <w:pPr>
+        <w:rPr/>
+      </w:pPr>
+      <w:r>
+        <w:rPr>
+          <w:rtl w:val="0"/>
+        </w:rPr>
+        <w:t xml:space="preserve">Decisions: Liza will create Use Case Diagram and Use Case Scenarios, Ksenia will start to do Class Diagram and Class Descriptions, Uliana will do Object Identification and CRC</w:t>
+      </w:r>
+    </w:p>
+    <w:p>
+      <w:pPr>
+        <w:rPr/>
+      </w:pPr>
+      <w:r>
+        <w:rPr>
+          <w:rtl w:val="0"/>
+        </w:rPr>
+        <w:t xml:space="preserve">Previous tasks completion: Phase 1 done!</w:t>
+      </w:r>
+    </w:p>
+    <w:p>
+      <w:pPr>
+        <w:rPr/>
+      </w:pPr>
+      <w:r>
+        <w:rPr>
+          <w:rtl w:val="0"/>
+        </w:rPr>
+        <w:t xml:space="preserve">Planned tasks for the week: Object Identification and CRC (Uliana), Use Case Diagram and Use Case Scenarios(Liza), Class Diagram and Class Descriptions(Ksenia)</w:t>
+      </w:r>
+    </w:p>
+    <w:p>
+      <w:pPr>
+        <w:rPr/>
+      </w:pPr>
+      <w:r>
+        <w:rPr>
+          <w:rtl w:val="0"/>
+        </w:rPr>
+        <w:t xml:space="preserve">Issues: none, on schedule</w:t>
+      </w:r>
+    </w:p>
+    <w:p>
+      <w:pPr>
+        <w:rPr/>
+      </w:pPr>
+      <w:r>
+        <w:rPr>
+          <w:rtl w:val="0"/>
+        </w:rPr>
+        <w:t xml:space="preserve">Meeting recording: </w:t>
+      </w:r>
+      <w:hyperlink r:id="rId8">
+        <w:r>
+          <w:rPr>
+            <w:color w:val="1155cc"/>
+            <w:u w:val="single"/>
+            <w:rtl w:val="0"/>
+          </w:rPr>
+          <w:t xml:space="preserve">https://www.loom.com/share/c6399b4903644bf68f3c23422957fd61</w:t>
+        </w:r>
+      </w:hyperlink>
+      <w:r>
+        <w:rPr>
+          <w:rtl w:val="0"/>
+        </w:rPr>
+        <w:t xml:space="preserve"> </w:t>
+      </w:r>
+    </w:p>
+    <w:p>
+      <w:pPr>
+        <w:rPr/>
+      </w:pPr>
+      <w:r>
+        <w:rPr>
+          <w:rtl w:val="0"/>
+        </w:rPr>
+      </w:r>
+    </w:p>
+    <w:p>
+      <w:pPr>
+        <w:rPr/>
+      </w:pPr>
+      <w:r>
+        <w:rPr>
+          <w:rtl w:val="0"/>
+        </w:rPr>
       </w:r>
     </w:p>
     <w:p>

</xml_diff>

<commit_message>
10/11/26-10/05/26 update team journal
</commit_message>
<xml_diff>
--- a/docs/Team Journal.docx
+++ b/docs/Team Journal.docx
@@ -359,6 +359,150 @@
           <w:rtl w:val="0"/>
         </w:rPr>
         <w:t xml:space="preserve"> </w:t>
+      </w:r>
+    </w:p>
+    <w:p>
+      <w:pPr>
+        <w:rPr/>
+      </w:pPr>
+      <w:r>
+        <w:rPr>
+          <w:rtl w:val="0"/>
+        </w:rPr>
+      </w:r>
+    </w:p>
+    <w:p>
+      <w:pPr>
+        <w:rPr/>
+      </w:pPr>
+      <w:r>
+        <w:rPr>
+          <w:rtl w:val="0"/>
+        </w:rPr>
+        <w:t xml:space="preserve">Week 4: 10/05/26-10/11/26</w:t>
+      </w:r>
+    </w:p>
+    <w:p>
+      <w:pPr>
+        <w:rPr/>
+      </w:pPr>
+      <w:r>
+        <w:rPr>
+          <w:rtl w:val="0"/>
+        </w:rPr>
+        <w:t xml:space="preserve">10/06/26 meeting</w:t>
+      </w:r>
+    </w:p>
+    <w:p>
+      <w:pPr>
+        <w:rPr/>
+      </w:pPr>
+      <w:r>
+        <w:rPr>
+          <w:rtl w:val="0"/>
+        </w:rPr>
+        <w:t xml:space="preserve">Discussed: use case diagram and use case scenarios, requirements, uml diagram</w:t>
+      </w:r>
+    </w:p>
+    <w:p>
+      <w:pPr>
+        <w:rPr/>
+      </w:pPr>
+      <w:r>
+        <w:rPr>
+          <w:rtl w:val="0"/>
+        </w:rPr>
+        <w:t xml:space="preserve">Decisions: Liza and Ulia will collaborate with Ksenia and finish uml diagram and do class description, Liza will show use cases and requirements redaction to Valeriy and will start to do test plan and initial code, Uliana will do Object Identification and CRC and Liza and Ksenia will help her with it.</w:t>
+      </w:r>
+    </w:p>
+    <w:p>
+      <w:pPr>
+        <w:rPr/>
+      </w:pPr>
+      <w:r>
+        <w:rPr>
+          <w:rtl w:val="0"/>
+        </w:rPr>
+        <w:t xml:space="preserve">Previous tasks completion: Liza created use case diagram and most of the use cases, Ksenia start to do uml diagram, Ulia start to do Object Identification and CRC.</w:t>
+      </w:r>
+    </w:p>
+    <w:p>
+      <w:pPr>
+        <w:rPr/>
+      </w:pPr>
+      <w:r>
+        <w:rPr>
+          <w:rtl w:val="0"/>
+        </w:rPr>
+        <w:t xml:space="preserve">Planned tasks for the week: Object Identification and CRC (Uliana), Test plan(Liza), Class Diagram and Class Descriptions(Ksenia)</w:t>
+      </w:r>
+    </w:p>
+    <w:p>
+      <w:pPr>
+        <w:rPr/>
+      </w:pPr>
+      <w:r>
+        <w:rPr>
+          <w:rtl w:val="0"/>
+        </w:rPr>
+        <w:t xml:space="preserve">Issues: need to ask Valeriy about use cases again, on schedule</w:t>
+      </w:r>
+    </w:p>
+    <w:p>
+      <w:pPr>
+        <w:rPr/>
+      </w:pPr>
+      <w:r>
+        <w:rPr>
+          <w:rtl w:val="0"/>
+        </w:rPr>
+        <w:t xml:space="preserve">Meeting recording: </w:t>
+      </w:r>
+      <w:hyperlink r:id="rId9">
+        <w:r>
+          <w:rPr>
+            <w:color w:val="1155cc"/>
+            <w:u w:val="single"/>
+            <w:rtl w:val="0"/>
+          </w:rPr>
+          <w:t xml:space="preserve">https://www.loom.com/share/8875ca92f78540f7b2cfa70be1781912</w:t>
+        </w:r>
+      </w:hyperlink>
+      <w:r>
+        <w:rPr>
+          <w:rtl w:val="0"/>
+        </w:rPr>
+        <w:t xml:space="preserve"> </w:t>
+      </w:r>
+    </w:p>
+    <w:p>
+      <w:pPr>
+        <w:rPr/>
+      </w:pPr>
+      <w:r>
+        <w:rPr>
+          <w:rtl w:val="0"/>
+        </w:rPr>
+      </w:r>
+    </w:p>
+    <w:p>
+      <w:pPr>
+        <w:rPr/>
+      </w:pPr>
+      <w:r>
+        <w:rPr>
+          <w:rtl w:val="0"/>
+        </w:rPr>
+      </w:r>
+    </w:p>
+    <w:p>
+      <w:pPr>
+        <w:rPr/>
+      </w:pPr>
+      <w:r>
+        <w:rPr>
+          <w:rtl w:val="0"/>
+        </w:rPr>
       </w:r>
     </w:p>
     <w:p>

</xml_diff>

<commit_message>
10/12/26-10/18/26 update team journal
</commit_message>
<xml_diff>
--- a/docs/Team Journal.docx
+++ b/docs/Team Journal.docx
@@ -473,6 +473,130 @@
           <w:rtl w:val="0"/>
         </w:rPr>
         <w:t xml:space="preserve"> </w:t>
+      </w:r>
+    </w:p>
+    <w:p>
+      <w:pPr>
+        <w:rPr/>
+      </w:pPr>
+      <w:r>
+        <w:rPr>
+          <w:rtl w:val="0"/>
+        </w:rPr>
+      </w:r>
+    </w:p>
+    <w:p>
+      <w:pPr>
+        <w:rPr/>
+      </w:pPr>
+      <w:r>
+        <w:rPr>
+          <w:rtl w:val="0"/>
+        </w:rPr>
+        <w:t xml:space="preserve">Week 5: 10/12/26-10/18/26</w:t>
+      </w:r>
+    </w:p>
+    <w:p>
+      <w:pPr>
+        <w:rPr/>
+      </w:pPr>
+      <w:r>
+        <w:rPr>
+          <w:rtl w:val="0"/>
+        </w:rPr>
+        <w:t xml:space="preserve">10/16/26 meeting</w:t>
+      </w:r>
+    </w:p>
+    <w:p>
+      <w:pPr>
+        <w:rPr/>
+      </w:pPr>
+      <w:r>
+        <w:rPr>
+          <w:rtl w:val="0"/>
+        </w:rPr>
+        <w:t xml:space="preserve">Discussed: use case diagram and use case scenarios, uml diagram, crc diagram, test plan</w:t>
+      </w:r>
+    </w:p>
+    <w:p>
+      <w:pPr>
+        <w:rPr/>
+      </w:pPr>
+      <w:r>
+        <w:rPr>
+          <w:rtl w:val="0"/>
+        </w:rPr>
+        <w:t xml:space="preserve">Decisions: Ulia will finish CRC diagram and document formatting, Liza will check all document information, Ksenia will create initial code.</w:t>
+      </w:r>
+    </w:p>
+    <w:p>
+      <w:pPr>
+        <w:rPr/>
+      </w:pPr>
+      <w:r>
+        <w:rPr>
+          <w:rtl w:val="0"/>
+        </w:rPr>
+        <w:t xml:space="preserve">Previous tasks completion: uml diagram done, Object Identification and CRC started.</w:t>
+      </w:r>
+    </w:p>
+    <w:p>
+      <w:pPr>
+        <w:rPr/>
+      </w:pPr>
+      <w:r>
+        <w:rPr>
+          <w:rtl w:val="0"/>
+        </w:rPr>
+        <w:t xml:space="preserve">Planned tasks for the week: finish CRC diagram and document formatting(Uliana), check the document(Liza), initial code(Ksenia)</w:t>
+      </w:r>
+    </w:p>
+    <w:p>
+      <w:pPr>
+        <w:rPr/>
+      </w:pPr>
+      <w:r>
+        <w:rPr>
+          <w:rtl w:val="0"/>
+        </w:rPr>
+        <w:t xml:space="preserve">Issues: -</w:t>
+      </w:r>
+    </w:p>
+    <w:p>
+      <w:pPr>
+        <w:rPr/>
+      </w:pPr>
+      <w:r>
+        <w:rPr>
+          <w:rtl w:val="0"/>
+        </w:rPr>
+        <w:t xml:space="preserve">Meeting recording: </w:t>
+      </w:r>
+      <w:hyperlink r:id="rId10">
+        <w:r>
+          <w:rPr>
+            <w:color w:val="1155cc"/>
+            <w:u w:val="single"/>
+            <w:rtl w:val="0"/>
+          </w:rPr>
+          <w:t xml:space="preserve">https://www.loom.com/share/4bc87bb6ea924f718740f85ff1995624</w:t>
+        </w:r>
+      </w:hyperlink>
+      <w:r>
+        <w:rPr>
+          <w:rtl w:val="0"/>
+        </w:rPr>
+        <w:t xml:space="preserve"> </w:t>
+      </w:r>
+    </w:p>
+    <w:p>
+      <w:pPr>
+        <w:rPr/>
+      </w:pPr>
+      <w:r>
+        <w:rPr>
+          <w:rtl w:val="0"/>
+        </w:rPr>
       </w:r>
     </w:p>
     <w:p>

</xml_diff>

<commit_message>
10/19/26-10/25/26 update team journal
</commit_message>
<xml_diff>
--- a/docs/Team Journal.docx
+++ b/docs/Team Journal.docx
@@ -580,6 +580,120 @@
             <w:rtl w:val="0"/>
           </w:rPr>
           <w:t xml:space="preserve">https://www.loom.com/share/4bc87bb6ea924f718740f85ff1995624</w:t>
+        </w:r>
+      </w:hyperlink>
+      <w:r>
+        <w:rPr>
+          <w:rtl w:val="0"/>
+        </w:rPr>
+        <w:t xml:space="preserve"> </w:t>
+      </w:r>
+    </w:p>
+    <w:p>
+      <w:pPr>
+        <w:rPr/>
+      </w:pPr>
+      <w:r>
+        <w:rPr>
+          <w:rtl w:val="0"/>
+        </w:rPr>
+      </w:r>
+    </w:p>
+    <w:p>
+      <w:pPr>
+        <w:rPr/>
+      </w:pPr>
+      <w:r>
+        <w:rPr>
+          <w:rtl w:val="0"/>
+        </w:rPr>
+        <w:t xml:space="preserve">Week 6: 10/19/26-10/25/26</w:t>
+      </w:r>
+    </w:p>
+    <w:p>
+      <w:pPr>
+        <w:rPr/>
+      </w:pPr>
+      <w:r>
+        <w:rPr>
+          <w:rtl w:val="0"/>
+        </w:rPr>
+        <w:t xml:space="preserve">10/23/26 meeting</w:t>
+      </w:r>
+    </w:p>
+    <w:p>
+      <w:pPr>
+        <w:rPr/>
+      </w:pPr>
+      <w:r>
+        <w:rPr>
+          <w:rtl w:val="0"/>
+        </w:rPr>
+        <w:t xml:space="preserve">Discussed: plan for next week, who which part of the code will be doing</w:t>
+      </w:r>
+    </w:p>
+    <w:p>
+      <w:pPr>
+        <w:rPr/>
+      </w:pPr>
+      <w:r>
+        <w:rPr>
+          <w:rtl w:val="0"/>
+        </w:rPr>
+        <w:t xml:space="preserve">Decisions: Ulia will finish to connect MySQL, Spring boot and react, Liza will do quizzes and gradebook, Ksenia will do course content and materials.</w:t>
+      </w:r>
+    </w:p>
+    <w:p>
+      <w:pPr>
+        <w:rPr/>
+      </w:pPr>
+      <w:r>
+        <w:rPr>
+          <w:rtl w:val="0"/>
+        </w:rPr>
+        <w:t xml:space="preserve">Previous tasks completion: phase 2 successfully passed!</w:t>
+      </w:r>
+    </w:p>
+    <w:p>
+      <w:pPr>
+        <w:rPr/>
+      </w:pPr>
+      <w:r>
+        <w:rPr>
+          <w:rtl w:val="0"/>
+        </w:rPr>
+        <w:t xml:space="preserve">Planned tasks for the week: start do create the code</w:t>
+      </w:r>
+    </w:p>
+    <w:p>
+      <w:pPr>
+        <w:rPr/>
+      </w:pPr>
+      <w:r>
+        <w:rPr>
+          <w:rtl w:val="0"/>
+        </w:rPr>
+        <w:t xml:space="preserve">Issues: -</w:t>
+      </w:r>
+    </w:p>
+    <w:p>
+      <w:pPr>
+        <w:rPr/>
+      </w:pPr>
+      <w:r>
+        <w:rPr>
+          <w:rtl w:val="0"/>
+        </w:rPr>
+        <w:t xml:space="preserve">Meeting recording: </w:t>
+      </w:r>
+      <w:hyperlink r:id="rId11">
+        <w:r>
+          <w:rPr>
+            <w:color w:val="1155cc"/>
+            <w:u w:val="single"/>
+            <w:rtl w:val="0"/>
+          </w:rPr>
+          <w:t xml:space="preserve">https://www.loom.com/share/385a583d61b44c73982d9f1260485057</w:t>
         </w:r>
       </w:hyperlink>
       <w:r>

</xml_diff>